<commit_message>
README rebuilt around the brand: banner, live demo link first, two minute tour, problem, five moments, numbers, then diagrams, contracts, measured components and reference; reports, technical document and PDFs regenerated with the redeployed contracts
</commit_message>
<xml_diff>
--- a/docs/Zishi_Technical_Document.docx
+++ b/docs/Zishi_Technical_Document.docx
@@ -2565,7 +2565,7 @@
               <w:rPr>
                 <w:sz w:val="16"/>
               </w:rPr>
-              <w:t>0x14cDb3Dd28C9F2F39Fe49FE8c319f113a3F58754</w:t>
+              <w:t>0x6161f6e08c8695849e7A8aF74c39a5A1056d5435</w:t>
             </w:r>
           </w:p>
         </w:tc>
@@ -2609,7 +2609,7 @@
               <w:rPr>
                 <w:sz w:val="16"/>
               </w:rPr>
-              <w:t>0xB4C2A66F3CD59b9D2BF4D4D070BB07eB6f11Bb4A</w:t>
+              <w:t>0xAbE83C0dD54EAd67DB63C8f9e854f00756f29952</w:t>
             </w:r>
           </w:p>
         </w:tc>
@@ -13055,7 +13055,7 @@
               <w:rPr>
                 <w:sz w:val="15"/>
               </w:rPr>
-              <w:t>Lender proves a violation on a live job: compensation, no bounty</w:t>
+              <w:t>Lender proves a vendor violation on a live job: all to the treasury, no bounty, nothing to the pilot</w:t>
             </w:r>
           </w:p>
         </w:tc>
@@ -13376,7 +13376,7 @@
               <w:rPr>
                 <w:sz w:val="14"/>
               </w:rPr>
-              <w:t>0x14cDb3Dd28C9F2F39Fe49FE8c319f113a3F58754</w:t>
+              <w:t>0x6161f6e08c8695849e7A8aF74c39a5A1056d5435</w:t>
             </w:r>
           </w:p>
         </w:tc>
@@ -13390,7 +13390,7 @@
               <w:rPr>
                 <w:sz w:val="14"/>
               </w:rPr>
-              <w:t>0xfc3dc2b9ce33c71caabfdbe96e262f371a26c42ceb226e9cc548439cc6ea74eb</w:t>
+              <w:t>0x68f7117ae33a89819473d89a4ec2a70d2a5a7da8c681721dfdb68d37ecd5c578</w:t>
             </w:r>
           </w:p>
         </w:tc>
@@ -13404,7 +13404,7 @@
               <w:rPr>
                 <w:sz w:val="14"/>
               </w:rPr>
-              <w:t>1,931,237</w:t>
+              <w:t>1,949,523</w:t>
             </w:r>
           </w:p>
         </w:tc>
@@ -13492,7 +13492,7 @@
               <w:rPr>
                 <w:sz w:val="14"/>
               </w:rPr>
-              <w:t>0xB4C2A66F3CD59b9D2BF4D4D070BB07eB6f11Bb4A</w:t>
+              <w:t>0xAbE83C0dD54EAd67DB63C8f9e854f00756f29952</w:t>
             </w:r>
           </w:p>
         </w:tc>
@@ -13506,7 +13506,7 @@
               <w:rPr>
                 <w:sz w:val="14"/>
               </w:rPr>
-              <w:t>0xda8db76f1842f0cbe203c1049029411c5a6f0c3ce8fb4cc853c4ed0a34059742</w:t>
+              <w:t>0x97227e36f9d0c8beaa5fdd3e571ac0123e21c52f1017c4a2dd1bfdb40d2f6c1e</w:t>
             </w:r>
           </w:p>
         </w:tc>
@@ -13530,7 +13530,7 @@
     <w:p>
       <w:r>
         <w:rPr/>
-        <w:t>One real run of the fleet scenario captured from the public app in real mode, every receipt fetched back from the chain when docs/EXECUTION_EVIDENCE.md was generated (commit 707fb733f88b): 40 transactions, 40 succeeded, 15 IntentLog commits, 0.0000106 ETH in gas. Each hash opens at https://sepolia.basescan.org/tx/&lt;hash&gt;.</w:t>
+        <w:t>One real run of the fleet scenario captured from the public app in real mode, every receipt fetched back from the chain when docs/EXECUTION_EVIDENCE.md was generated (commit b568945ceae8): 40 transactions, 40 succeeded, 15 IntentLog commits, 0.0000106 ETH in gas. Each hash opens at https://sepolia.basescan.org/tx/&lt;hash&gt;.</w:t>
       </w:r>
     </w:p>
     <w:tbl>

</xml_diff>

<commit_message>
FISCO BCOS: value on chain, one real run on Base and FISCO, FISCO badge in the feed
fisco.sh switches on native balances with the chain admin key and runs a paid job (vendor bond, job fee locked and refunded); one real fleet run commits 15 of 15 intents to Base Sepolia and FISCO with the same hash; pnpm fisco reports it; verify.ts dedupes tx states and decodes IntentLog commits; the transaction feed marks FISCO txs and shows the FISCO hash; README, technical document, roadmap and problems log describe the WeBank stack
</commit_message>
<xml_diff>
--- a/docs/Zishi_Technical_Document.docx
+++ b/docs/Zishi_Technical_Document.docx
@@ -2746,8 +2746,150 @@
           </w:p>
         </w:tc>
       </w:tr>
+      <w:tr>
+        <w:tc>
+          <w:tcPr>
+            <w:tcW w:type="dxa" w:w="2160"/>
+          </w:tcPr>
+          <w:p>
+            <w:r/>
+            <w:r>
+              <w:rPr>
+                <w:sz w:val="16"/>
+              </w:rPr>
+              <w:t>FISCO BCOS 3.16.3, chain id 20200</w:t>
+            </w:r>
+          </w:p>
+        </w:tc>
+        <w:tc>
+          <w:tcPr>
+            <w:tcW w:type="dxa" w:w="4320"/>
+          </w:tcPr>
+          <w:p>
+            <w:r/>
+            <w:r>
+              <w:rPr>
+                <w:sz w:val="16"/>
+              </w:rPr>
+              <w:t>WeBank's consortium chain, the lender's ledger: the same four contracts, every intent committed to its IntentLog</w:t>
+            </w:r>
+          </w:p>
+        </w:tc>
+        <w:tc>
+          <w:tcPr>
+            <w:tcW w:type="dxa" w:w="3168"/>
+          </w:tcPr>
+          <w:p>
+            <w:r/>
+            <w:r>
+              <w:rPr>
+                <w:sz w:val="16"/>
+              </w:rPr>
+              <w:t>IntentLog 0x9555c12c2789e44868070d0d877f9baadabe4f54</w:t>
+            </w:r>
+          </w:p>
+        </w:tc>
+      </w:tr>
+      <w:tr>
+        <w:tc>
+          <w:tcPr>
+            <w:tcW w:type="dxa" w:w="2160"/>
+          </w:tcPr>
+          <w:p>
+            <w:r/>
+            <w:r>
+              <w:rPr>
+                <w:sz w:val="16"/>
+              </w:rPr>
+              <w:t>FATE 2.2.0</w:t>
+            </w:r>
+          </w:p>
+        </w:tc>
+        <w:tc>
+          <w:tcPr>
+            <w:tcW w:type="dxa" w:w="4320"/>
+          </w:tcPr>
+          <w:p>
+            <w:r/>
+            <w:r>
+              <w:rPr>
+                <w:sz w:val="16"/>
+              </w:rPr>
+              <w:t>WeBank's federated learning framework: three lenders train one pilot credit model</w:t>
+            </w:r>
+          </w:p>
+        </w:tc>
+        <w:tc>
+          <w:tcPr>
+            <w:tcW w:type="dxa" w:w="3168"/>
+          </w:tcPr>
+          <w:p>
+            <w:r/>
+            <w:r>
+              <w:rPr>
+                <w:sz w:val="16"/>
+              </w:rPr>
+              <w:t>offline, fate/run.sh</w:t>
+            </w:r>
+          </w:p>
+        </w:tc>
+      </w:tr>
     </w:tbl>
     <w:p/>
+    <w:p>
+      <w:pPr>
+        <w:pStyle w:val="Heading2"/>
+      </w:pPr>
+      <w:r>
+        <w:rPr/>
+        <w:t>Built on WeBank's stack: FISCO BCOS and FATE</w:t>
+      </w:r>
+    </w:p>
+    <w:p>
+      <w:pPr>
+        <w:pStyle w:val="ListBullet2"/>
+      </w:pPr>
+      <w:r>
+        <w:rPr/>
+        <w:t>FISCO BCOS. The four contracts run unchanged on a FISCO BCOS 3.16.3 node in Docker, compiled with evm_version paris because FISCO's EVM has no PUSH0. The engine reaches it through FISCO's Web3 JSON-RPC with viem, the same code path as Base Sepolia. A full run sent 78 transactions to FISCO, 78 with a successful receipt; all 30 of 30 IntentLog commits read back with the engine's intent hash.</w:t>
+      </w:r>
+    </w:p>
+    <w:p>
+      <w:pPr>
+        <w:pStyle w:val="ListBullet2"/>
+      </w:pPr>
+      <w:r>
+        <w:rPr/>
+        <w:t>Two ledgers, one hash. With both chains set, every intent is committed to the IntentLog on Base Sepolia, public and checkable by anyone, and on FISCO BCOS, the licensed lender's consortium ledger, and the feed shows both hashes. In one real run 15 of 15 intents have a successful receipt on both chains with the same hash.</w:t>
+      </w:r>
+    </w:p>
+    <w:p>
+      <w:pPr>
+        <w:pStyle w:val="ListBullet2"/>
+      </w:pPr>
+      <w:r>
+        <w:rPr/>
+        <w:t>FATE. Three lenders train one pilot default model with FATE 2.2.0 HomoLR and secure aggregation, no repayment records shared. Held out AUC goes from 0.729 for one lender alone to 0.782 federated; the model sets a new pilot's starting credit score and cuts the instalment share error from 335 to 152 basis points. Data is synthetic and seeded.</w:t>
+      </w:r>
+    </w:p>
+    <w:p>
+      <w:pPr>
+        <w:pStyle w:val="ListBullet2"/>
+      </w:pPr>
+      <w:r>
+        <w:rPr/>
+        <w:t>Model provenance. The FATE model's sha256 is committed to the FISCO IntentLog (tx 0x6a6be28d91..., block 82) and read back, so a lender can prove which model priced each pilot.</w:t>
+      </w:r>
+    </w:p>
+    <w:p>
+      <w:pPr>
+        <w:pStyle w:val="ListBullet2"/>
+      </w:pPr>
+      <w:r>
+        <w:rPr/>
+        <w:t>Scope. The FISCO node runs locally and is reproduced with contracts/script/fisco.sh; the public demo cannot reach it, so it shows FISCO through the evidence file. FISCO's block time is in milliseconds, so JobBoard's windows need a unit fix before live jobs run there.</w:t>
+      </w:r>
+    </w:p>
     <w:p>
       <w:pPr>
         <w:pStyle w:val="Heading1"/>

</xml_diff>

<commit_message>
Judge review fixes: one full job on the deployed contracts with value moving (Base Sepolia and FISCO), 15 contract layer attacks and Lease in Solidity (68 tests), button behind the demo token, missing sensor channels hold, classifier retrained without the attack texts with Wilson intervals, one oracle false alarm rate, ask the agent dialogue, self assessment on the official headings, NFRA, PBoC and CAAC map
</commit_message>
<xml_diff>
--- a/docs/Zishi_Technical_Document.docx
+++ b/docs/Zishi_Technical_Document.docx
@@ -1022,7 +1022,7 @@
               <w:rPr>
                 <w:sz w:val="16"/>
               </w:rPr>
-              <w:t>Buhlmann credibility score that moves the instalment share inside the band; CUSUM monitors on classifier risk and deny rate.</w:t>
+              <w:t>Buhlmann credibility score that shows the instalment share it would set inside the band (shown, not yet applied: the paid instalment uses the demo rate); CUSUM monitors on classifier risk and deny rate (monitoring, not decisions).</w:t>
             </w:r>
           </w:p>
         </w:tc>
@@ -1827,7 +1827,7 @@
               <w:rPr>
                 <w:sz w:val="16"/>
               </w:rPr>
-              <w:t>Logistic classifier, hashed character 1 to 3 grams, 301 training and 100 held out messages</w:t>
+              <w:t>Logistic classifier, hashed character 1 to 3 grams, 262 training and 87 held out messages</w:t>
             </w:r>
           </w:p>
         </w:tc>
@@ -2316,7 +2316,7 @@
       </w:pPr>
       <w:r>
         <w:rPr/>
-        <w:t>Messages: a hand written corpus of 401 messages in English and Chinese, a quarter held out by seed 20251020.</w:t>
+        <w:t>Messages: a hand written corpus of 349 messages in English and Chinese, a quarter held out by seed 20251020.</w:t>
       </w:r>
     </w:p>
     <w:p>
@@ -3667,7 +3667,7 @@
               <w:rPr>
                 <w:sz w:val="16"/>
               </w:rPr>
-              <w:t>401 messages, 100 held out, seed 20251020</w:t>
+              <w:t>349 messages, 87 held out, seed 20251020</w:t>
             </w:r>
           </w:p>
         </w:tc>
@@ -3681,7 +3681,7 @@
               <w:rPr>
                 <w:sz w:val="16"/>
               </w:rPr>
-              <w:t>accuracy 95.0%, precision 93.3%, recall 95.5%, false alarm 5.4%</w:t>
+              <w:t>accuracy 93.1%, precision 100.0%, recall 81.3%, false alarm 0.0%</w:t>
             </w:r>
           </w:p>
         </w:tc>
@@ -5138,7 +5138,43 @@
       </w:pPr>
       <w:r>
         <w:rPr/>
-        <w:t>The demo runs on a public test network with test ETH for gas and yuan as demo units. Production settles in bank money on a consortium chain (FISCO BCOS) or in fiat; there is no public token.</w:t>
+        <w:t>The demo runs on a public test network with test ETH for gas and yuan as demo units. Production settles in bank money on a consortium chain (FISCO BCOS) or in fiat; there is no public token, in line with the PBoC's 2021 notice on virtual currency trading.</w:t>
+      </w:r>
+    </w:p>
+    <w:p>
+      <w:pPr>
+        <w:pStyle w:val="ListBullet2"/>
+      </w:pPr>
+      <w:r>
+        <w:rPr/>
+        <w:t>Financial leasing (融资租赁): the lessor is a company licensed under the NFRA's Measures for the Administration of Financial Leasing Companies (2024) or the interim measures for financing lease companies (2020). Zishi services the contract inside a signed rate band; it does not lend.</w:t>
+      </w:r>
+    </w:p>
+    <w:p>
+      <w:pPr>
+        <w:pStyle w:val="ListBullet2"/>
+      </w:pPr>
+      <w:r>
+        <w:rPr/>
+        <w:t>Payments: fees settle through a licensed bank or payment institution under the Regulations on Non-bank Payment Institutions (2024), or e-CNY. The chain records events; it does not custody customer funds.</w:t>
+      </w:r>
+    </w:p>
+    <w:p>
+      <w:pPr>
+        <w:pStyle w:val="ListBullet2"/>
+      </w:pPr>
+      <w:r>
+        <w:rPr/>
+        <w:t>Drone operations: under the CAAC's Interim Regulations on the Flight Management of Unmanned Aircraft (2024) and CCAR-92, the pilot holds the operator licence and operation certificate, the drone is real name registered and third party liability insurance is in force. The job terms carry these as preconditions.</w:t>
+      </w:r>
+    </w:p>
+    <w:p>
+      <w:pPr>
+        <w:pStyle w:val="ListBullet2"/>
+      </w:pPr>
+      <w:r>
+        <w:rPr/>
+        <w:t>Hong Kong: the same split under the HKMA (payments), the SFC (virtual asset activities) and the PDPO (personal data).</w:t>
       </w:r>
     </w:p>
     <w:p>
@@ -5148,6 +5184,42 @@
       <w:r>
         <w:rPr/>
         <w:t>Physical damage and third party liability are the pilot's drone insurance plus a human dispute path; the bonds cover rule breaks only.</w:t>
+      </w:r>
+    </w:p>
+    <w:p>
+      <w:pPr>
+        <w:pStyle w:val="Heading2"/>
+      </w:pPr>
+      <w:r>
+        <w:rPr/>
+        <w:t>Known risks</w:t>
+      </w:r>
+    </w:p>
+    <w:p>
+      <w:pPr>
+        <w:pStyle w:val="ListBullet2"/>
+      </w:pPr>
+      <w:r>
+        <w:rPr/>
+        <w:t>IntentLog.commit is permissionless and first writer wins per hash, so a third party could commit an agent's intent hash first and a compromised agent could skip committing; slashByProof then fails as not in log. Planned fix: commits restricted to the job's registered agent or bound to the job escrow, with Foundry tests, then redeploy.</w:t>
+      </w:r>
+    </w:p>
+    <w:p>
+      <w:pPr>
+        <w:pStyle w:val="ListBullet2"/>
+      </w:pPr>
+      <w:r>
+        <w:rPr/>
+        <w:t>Demo keys are derived from fixed public strings so runs replay identically; anyone can derive them. Production keys live in the secure element, a hardware device and HSMs.</w:t>
+      </w:r>
+    </w:p>
+    <w:p>
+      <w:pPr>
+        <w:pStyle w:val="ListBullet2"/>
+      </w:pPr>
+      <w:r>
+        <w:rPr/>
+        <w:t>Bond, JobBoard and Lease run as TypeScript mirrors in the live engine; a Foundry script runs one full job against the deployed contracts with its own evidence table.</w:t>
       </w:r>
     </w:p>
     <w:p>
@@ -13672,7 +13744,7 @@
     <w:p>
       <w:r>
         <w:rPr/>
-        <w:t>One real run of the fleet scenario captured from the public app in real mode, every receipt fetched back from the chain when docs/EXECUTION_EVIDENCE.md was generated (commit b568945ceae8): 40 transactions, 40 succeeded, 15 IntentLog commits, 0.0000106 ETH in gas. Each hash opens at https://sepolia.basescan.org/tx/&lt;hash&gt;.</w:t>
+        <w:t>One real run of the fleet scenario captured from the public app in real mode, every receipt fetched back from the chain when docs/EXECUTION_EVIDENCE.md was generated (commit 951f024678e6): 40 transactions, 40 succeeded, 15 IntentLog commits, 0.0000106 ETH in gas. Each hash opens at https://sepolia.basescan.org/tx/&lt;hash&gt;.</w:t>
       </w:r>
     </w:p>
     <w:tbl>

</xml_diff>